<commit_message>
Update Word draft with primary-source-verified international literature comparison
</commit_message>
<xml_diff>
--- a/논문_초안_서론부터결론까지.docx
+++ b/논문_초안_서론부터결론까지.docx
@@ -255,7 +255,39 @@
           <w:sz w:val="21"/>
           <w:szCs w:val="21"/>
         </w:rPr>
-        <w:t xml:space="preserve">기존 검색 트렌드 기반 예측 연구들은 크게 두 갈래로 나뉜다. 첫째는 텍스트마이닝·네트워크분석을 통한 사후적(descriptive) 트렌드 분석으로, 이미 화제가 된 키워드의 빈도·연결성 변화를 설명하는 데 그친다(박혜진, 2020; 임희숙·신재욱, 2021; 허준석, 2018). 둘째는 연속형 변수(시장점유율, 가격, 매출, 경제지수 등)에 대한 회귀 기반 예측으로, 검색량을 보조 변수로 추가했을 때 예측 오차가 줄어드는지를 검증한다(봉기태·이희상, 2020; 김병완, 2021; 문태남, 2017; 서주연, 2018). 그러나 이 두 갈래 모두 "특정 개별 키워드가 향후 이례적으로 급등(breakout)할 것인가"를 이진 분류 문제로 설정하지는 않았으며, 화장품처럼 성분·컨셉·제형·효능이라는 성격이 뚜렷이 다른 하위 유형 간에 예측 가능성 자체가 다를 수 있다는 가능성도 정면으로 다루지 않았다. 이병욱 외(2018)는 벤츠와 BMW라는 유사 카테고리 내에서도 검색량-매출 상관관계의 강도가 다르게 나타남을 보고했으나 그 원인은 규명하지 못했고, 김병수(2021)도 럭셔리·프리미엄 브랜드군 간 온라인 정보탐색 활성화 정도가 다름을 실증했을 뿐 이를 예측 모델의 성능 차이로 연결하지는 않았다. 본 연구는 바로 이 지점—개별 키워드의 breakout 여부를 예측하는 문제 설정 자체, 그리고 키워드 유형 간 예측 가능성 차이를 정면으로 비교하는 것—을 연구 공백으로 삼는다.</w:t>
+        <w:t xml:space="preserve">개별 항목의 "breakout(이례적 급부상) 여부"를 이진 분류 문제로 정식화하는 접근 자체는 사실 데이터마이닝 분야에서 이미 확립된 연구 흐름이다. 해시태그 도메인에서는 Ma, Sun &amp; Cong(2013)이 신규 해시태그의 인기 여부를 콘텐츠·맥락 feature 기반 분류 문제로 정식화했고, 주식 시장에서도 Ansary(2022)가 지지선·저항선 이탈(breakout)을 머신러닝 분류로 식별한 바 있다. 따라서 본 연구가 이러한 문제 설정 자체를 처음 시도하는 것은 아니다.</w:t>
+      </w:r>
+    </w:p>
+    <w:p>
+      <w:pPr>
+        <w:spacing w:after="140" w:line="300"/>
+        <w:jc w:val="both"/>
+      </w:pPr>
+      <w:r>
+        <w:rPr>
+          <w:rFonts w:ascii="맑은 고딕" w:cs="맑은 고딕" w:eastAsia="맑은 고딕" w:hAnsi="맑은 고딕"/>
+          <w:i w:val="false"/>
+          <w:iCs w:val="false"/>
+          <w:sz w:val="21"/>
+          <w:szCs w:val="21"/>
+        </w:rPr>
+        <w:t xml:space="preserve">이 문제 설정 안에서 카테고리·유형 간 예측가능성을 비교한 선례도 일부 있다. Ma, Sun &amp; Cong(2013)은 해시태그를 사건성으로 짧고 강하게 튀는 bursty 유형(#tsunami, #earthquake 등)과 꾸준히 인기가 유지되는 continuous 유형(#cancer, #singapore, #love 등)으로 나누어 동일한 예측 모델의 정확도를 비교했고, bursty 유형(Micro-F1 .640)이 continuous 유형(.560)보다 예측하기 쉽다는 결과를 실증했다. 그러나 이 비교는 트렌드의 형태(사후적으로 관찰된 궤적 패턴)에 따른 재분류이지, 본 연구처럼 키워드가 애초에 속한 의미론적 유형(성분 vs 컨셉 vs 제형 vs 효능)에 따른 사전적 카테고리 비교가 아니다. 가장 최근 연구인 BuzzProphet(Xu et al., 2025)이 공개한 HashView 벤치마크도 해시태그를 엔터테인먼트·사회·스포츠 등 10개 도메인으로 분류한 데이터를 포함하지만, 도메인 간 예측 성능을 비교하는 실험은 수행하지 않았다.</w:t>
+      </w:r>
+    </w:p>
+    <w:p>
+      <w:pPr>
+        <w:spacing w:after="140" w:line="300"/>
+        <w:jc w:val="both"/>
+      </w:pPr>
+      <w:r>
+        <w:rPr>
+          <w:rFonts w:ascii="맑은 고딕" w:cs="맑은 고딕" w:eastAsia="맑은 고딕" w:hAnsi="맑은 고딕"/>
+          <w:i w:val="false"/>
+          <w:iCs w:val="false"/>
+          <w:sz w:val="21"/>
+          <w:szCs w:val="21"/>
+        </w:rPr>
+        <w:t xml:space="preserve">이 문제 설정이 적용된 도메인과 그 안에서 다뤄진 질문은 본 연구와 뚜렷이 다르다. 첫째, 위 해외 연구들은 트위터·웨이보 해시태그나 주가처럼 실시간·고빈도 데이터가 풍부한 도메인에 한정되어 있으며, 네이버 검색 트렌드 데이터를 활용해 화장품 키워드의 breakout을 예측한 선례는 국내외 어디에도 확인되지 않았다. 흥미롭게도 Ma, Sun &amp; Cong(2013)은 논문 말미에서 "본 기법은 회사명·브랜드명·상품명 등 임의의 사전정의된 문자열(predefined string)의 인기도 예측에도 쉽게 확장 가능할 것"이라고 스스로 제언했는데, 본 연구는 이 제언을 화장품 키워드 도메인에서 실제로 실현하는 시도로 자리매김할 수 있다. 둘째, 국내 화장품 트렌드 관련 선행연구는 대부분 이미 발생한 트렌드를 사후적으로 설명하는 텍스트마이닝·의미연결망 분석에 머물러 있다(박혜진, 2020; 임희숙·신재욱, 2021; 허준석, 2018; 송재오, 2014). 셋째, 검색량을 연속형 변수(시장점유율, 가격, 매출 등)에 대한 회귀 예측의 보조 변수로 활용한 연구는 존재하지만(봉기태·이희상, 2020; 김병완, 2021; 문태남, 2017; 서주연, 2018), 이 역시 breakout 이진분류가 아니다. 넷째—가장 중요하게는—성분·컨셉·제형·효능처럼 의미론적으로 이질적인 키워드 유형 간에 예측 가능성 자체가 다를 수 있다는 점을 정면으로 비교한 연구는 화장품 국내 문헌은 물론, 위에서 확인한 해외 해시태그·주식 breakout 분류 연구(Ma, Sun &amp; Cong 2013의 bursty/continuous 비교, BuzzProphet의 도메인 분류를 포함)에도 없었다. 이병욱 외(2018)는 벤츠와 BMW라는 유사 카테고리 내에서도 검색량-매출 상관관계의 강도가 다르게 나타남을 보고했으나 그 원인은 규명하지 못했고, 김병수(2021)도 럭셔리·프리미엄 브랜드군 간 온라인 정보탐색 활성화 정도가 다름을 실증했을 뿐 이를 예측 모델의 성능 차이로 연결하지는 않았다. 본 연구는 바로 이 지점—breakout 이진분류라는 검증된 문제 설정을 화장품·네이버 검색 트렌드 도메인에 새롭게 적용하는 것, 그리고 트렌드의 형태가 아닌 키워드의 의미론적 유형 간 예측 가능성 차이를 정면으로 비교하는 것—을 연구 공백으로 삼는다.</w:t>
       </w:r>
     </w:p>
     <w:p>
@@ -357,7 +389,7 @@
           <w:sz w:val="21"/>
           <w:szCs w:val="21"/>
         </w:rPr>
-        <w:t xml:space="preserve">본 연구의 기여는 다음 세 가지로 요약된다. 첫째, 화장품 도메인에서 개별 키워드 단위의 breakout 이진 분류라는 새로운 문제 설정을 제시한다. 둘째, 카테고리 간 예측 가능성 비교를 통해 "어떤 유형의 트렌드가 더 예측하기 쉬운가"라는, 선행연구가 암시만 하고 규명하지 못했던 질문에 답한다. 셋째, 예측 결과를 실제 제품 데이터와 연결하여 R&amp;D·마케팅 실무에 바로 활용 가능한 형태로 제시한다.</w:t>
+        <w:t xml:space="preserve">본 연구의 기여는 다음 세 가지로 요약된다. 첫째, 해시태그·주식 도메인에서 검증된 breakout 이진 분류라는 문제 설정을 화장품·네이버 검색 트렌드 도메인에 처음으로 적용한다(문제 설정 자체의 발명이 아니라 도메인 전이가 기여임을 명확히 함). 둘째, 카테고리 간 예측 가능성 비교를 통해 "어떤 유형의 트렌드가 더 예측하기 쉬운가"라는, 국내외 선행연구가 암시만 하고 규명하지 못했던 질문에 답한다. 셋째, 예측 결과를 실제 제품 데이터와 연결하여 R&amp;D·마케팅 실무에 바로 활용 가능한 형태로 제시한다.</w:t>
       </w:r>
     </w:p>
     <w:p>
@@ -598,6 +630,70 @@
           <w:szCs w:val="21"/>
         </w:rPr>
         <w:t xml:space="preserve">김병완(2021)은 차량 내부속성만 사용한 베이스라인 모형과 네이버 검색량을 추가한 모형을 RMSE로 비교하는 ablation 설계를 통해, 소형/경형을 제외한 전 차급에서 검색량 추가 시 예측 오차가 3.5~4.8% 개선됨을 보였다. 이 연구는 (1) Q1-1.5IQR~Q3+1.5IQR 기준의 IQR 이상치 처리, (2) GridSearchCV와 5-fold 교차검증을 통한 다중 알고리즘(LR/SVM/DT/RF/XGBoost/LightGBM) 비교, (3) "외부 변수 추가가 예측력을 개선하는가"를 검증하는 ablation 프레임이라는 세 가지 방법론적 요소를 본 연구에 제공한다. 서주연(2018)은 패션 브랜드 매출을 ARDL(Autoregressive Distributed Lags) 모형으로 예측하며 매출 자기회귀 베이스라인(예측력 95.8%)과 브랜드 검색량·광고모델 정보량·프로모션을 추가한 모형(97.8%)을 비교해 동일한 ablation 논리를 재확인했고, 매출과 독립변수 간 교차상관(cross-correlation)이 가장 높은 시차(lag)를 모형에 반영하는 절차를 제시했다. 이 두 연구는 국내 석사논문에서 "외부변수 추가 시 예측력 개선"이라는 검증 구조가 반복적으로 채택된 표준적 접근임을 보여준다.</w:t>
+      </w:r>
+    </w:p>
+    <w:p>
+      <w:pPr>
+        <w:spacing w:after="140" w:line="300"/>
+        <w:jc w:val="both"/>
+      </w:pPr>
+      <w:r>
+        <w:rPr>
+          <w:rFonts w:ascii="맑은 고딕" w:cs="맑은 고딕" w:eastAsia="맑은 고딕" w:hAnsi="맑은 고딕"/>
+          <w:i w:val="false"/>
+          <w:iCs w:val="false"/>
+          <w:sz w:val="21"/>
+          <w:szCs w:val="21"/>
+        </w:rPr>
+        <w:t xml:space="preserve">한편, breakout·바이럴 여부를 개별 항목 단위의 분류 문제로 다룬 해외 연구도 이미 다수 존재한다. Ma, Sun &amp; Cong(2013)은 신규 트위터 해시태그의 인기 범위(5단계: not popular~extremely popular)를 분류 문제로 정식화하여, 해시태그 문자열·트윗 내용에서 추출한 content feature 7개와 해당 해시태그를 채택한 유저들의 소셜 그래프에서 추출한 contextual feature 11개를 Naïve Bayes·kNN·Decision Tree·SVM·로지스틱회귀 5개 분류기에 적용했다(31백만 건 트윗, 10-fold 교차검증). 로지스틱회귀가 all-feature 기준 Micro-F1 .598로 가장 우수했고, contextual feature가 content feature보다 예측력이 높다는 결과는 개별 항목 자체의 신호보다 주변 맥락(본 연구에서는 카테고리 수준 변수에 해당)이 예측에 더 중요할 수 있음을 시사한다. 이는 본 연구가 카테고리(성분/컨셉/제형/효능)를 단순 구분자가 아니라 feature·그룹 변수로 적극 활용하는 설계의 근거가 된다. 더 나아가 이 논문의 5.3절은 해시태그를 bursty(사건성)와 continuous(꾸준함) 두 유형으로 나눠 동일 모델의 예측정확도를 비교했는데(Micro-F1 .640 vs .560), 이는 "트렌드 유형에 따라 예측 가능성이 다르다"는 것을 정량적으로 보인 중요한 선례다 — 다만 이 유형 구분은 궤적의 형태에 따른 사후적 분류로, 본 연구의 의미론적 카테고리 비교와는 축이 다르다(2.4절에서 상술).</w:t>
+      </w:r>
+    </w:p>
+    <w:p>
+      <w:pPr>
+        <w:spacing w:after="140" w:line="300"/>
+        <w:jc w:val="both"/>
+      </w:pPr>
+      <w:r>
+        <w:rPr>
+          <w:rFonts w:ascii="맑은 고딕" w:cs="맑은 고딕" w:eastAsia="맑은 고딕" w:hAnsi="맑은 고딕"/>
+          <w:i w:val="false"/>
+          <w:iCs w:val="false"/>
+          <w:sz w:val="21"/>
+          <w:szCs w:val="21"/>
+        </w:rPr>
+        <w:t xml:space="preserve">주식 도메인에서는 Ansary(2022)가 종가의 지지선·저항선 이탈 여부를 breakout으로 정의(직전 2주 종가 범위 대비 98% 이내 횡보 후 이탈)하고 Decision Tree·Random Forest·AdaBoost·KNN·MLP·SVM 6개 분류기로 식별했다. breakout 후보가 비breakout보다 훨씬 적어 랜덤 언더샘플링으로 데이터를 균형화(432개)한 뒤 학습했으며, SVM(정확도 .814)과 MLP(.791)가 가장 우수했다. 이 연구에서 채택한 98%라는 고정 임계치는 본 연구가 기각한 "임의의 절대적 증가율 기준"과 성격이 같아, 오히려 본 연구가 Tukey IQR이라는 적응형 기준을 택한 것이 방법론적으로 더 정교하다는 대조 근거가 된다. 또한 breakout 후보가 희소 클래스라 언더샘플링이 필요했다는 점은, 본 연구도 카테고리별 breakout 비율이 낮을 가능성에 대비해 라벨 불균형 처리 방안을 사전에 고려해야 함을 시사한다.</w:t>
+      </w:r>
+    </w:p>
+    <w:p>
+      <w:pPr>
+        <w:spacing w:after="140" w:line="300"/>
+        <w:jc w:val="both"/>
+      </w:pPr>
+      <w:r>
+        <w:rPr>
+          <w:rFonts w:ascii="맑은 고딕" w:cs="맑은 고딕" w:eastAsia="맑은 고딕" w:hAnsi="맑은 고딕"/>
+          <w:i w:val="false"/>
+          <w:iCs w:val="false"/>
+          <w:sz w:val="21"/>
+          <w:szCs w:val="21"/>
+        </w:rPr>
+        <w:t xml:space="preserve">가장 최근에는 BuzzProphet(Xu et al., 2025, CIKM)이 해시태그 인기도 예측을 이진·다중분류가 아닌 회귀(log-정규화된 조회수 예측) 문제로 재구성하고, LLM(GPT-4o, o3-mini 등)이 생성한 토픽·오디언스·게시시점에 대한 정성적 추론(rationale)을 feature로 결합해 RMSE를 최대 2.8%, 상관계수를 최대 30% 개선했다. 이 논문은 관련연구에서 "선행 연구는 해시태그 인기도 예측을 임의 임계치로 구간화한 분류 문제로 다뤘다"고 명시적으로 서술하며 회귀로의 전환을 정당화한다. 국제 연구의 최신 흐름이 단순 분류를 넘어서고 있다는 점은 분명하나, 본 연구가 이진분류를 택한 것은 R&amp;D·마케팅 실무자가 결과를 직접 해석·활용하기 쉽도록 하려는 의도적 선택이며, 이 점은 한계이자 향후 확장 방향으로 Ⅴ장에서 논의한다.</w:t>
+      </w:r>
+    </w:p>
+    <w:p>
+      <w:pPr>
+        <w:spacing w:after="140" w:line="300"/>
+        <w:jc w:val="both"/>
+      </w:pPr>
+      <w:r>
+        <w:rPr>
+          <w:rFonts w:ascii="맑은 고딕" w:cs="맑은 고딕" w:eastAsia="맑은 고딕" w:hAnsi="맑은 고딕"/>
+          <w:i w:val="false"/>
+          <w:iCs w:val="false"/>
+          <w:sz w:val="21"/>
+          <w:szCs w:val="21"/>
+        </w:rPr>
+        <w:t xml:space="preserve">이들 해외 연구는 breakout·바이럴 분류라는 문제 설정 자체를, 그리고 일부는 트렌드 유형 간 예측가능성 비교까지도 이미 시도했다는 점에서, 본 연구가 이러한 문제 설정이나 카테고리 비교라는 아이디어 자체를 "처음 제시"한다고 주장할 수는 없다. 그러나 이 설정이 검색 트렌드 데이터·화장품 도메인에 적용된 사례, 그리고 트렌드의 형태가 아닌 키워드의 의미론적 유형에 따른 예측가능성을 비교한 사례는 국내외 문헌 어디에도 확인되지 않았으며, 이것이 본 연구가 실제로 채우는 공백이다.</w:t>
       </w:r>
     </w:p>
     <w:p>
@@ -1303,6 +1399,123 @@
             <w:r>
               <w:rPr>
                 <w:rFonts w:ascii="맑은 고딕" w:cs="맑은 고딕" w:eastAsia="맑은 고딕" w:hAnsi="맑은 고딕"/>
+                <w:b w:val="false"/>
+                <w:bCs w:val="false"/>
+                <w:sz w:val="18"/>
+                <w:szCs w:val="18"/>
+              </w:rPr>
+              <w:t xml:space="preserve">해시태그/주식 breakout·바이럴 분류(해외)</w:t>
+            </w:r>
+          </w:p>
+        </w:tc>
+        <w:tc>
+          <w:tcPr>
+            <w:tcW w:type="dxa" w:w="2600"/>
+            <w:tcMar>
+              <w:top w:type="dxa" w:w="80"/>
+              <w:left w:type="dxa" w:w="100"/>
+              <w:bottom w:type="dxa" w:w="80"/>
+              <w:right w:type="dxa" w:w="100"/>
+            </w:tcMar>
+          </w:tcPr>
+          <w:p>
+            <w:r>
+              <w:rPr>
+                <w:rFonts w:ascii="맑은 고딕" w:cs="맑은 고딕" w:eastAsia="맑은 고딕" w:hAnsi="맑은 고딕"/>
+                <w:b w:val="false"/>
+                <w:bCs w:val="false"/>
+                <w:sz w:val="18"/>
+                <w:szCs w:val="18"/>
+              </w:rPr>
+              <w:t xml:space="preserve">Ma, Sun &amp; Cong(2013), Ansary(2022), BuzzProphet(2025)</w:t>
+            </w:r>
+          </w:p>
+        </w:tc>
+        <w:tc>
+          <w:tcPr>
+            <w:tcW w:type="dxa" w:w="2100"/>
+            <w:tcMar>
+              <w:top w:type="dxa" w:w="80"/>
+              <w:left w:type="dxa" w:w="100"/>
+              <w:bottom w:type="dxa" w:w="80"/>
+              <w:right w:type="dxa" w:w="100"/>
+            </w:tcMar>
+          </w:tcPr>
+          <w:p>
+            <w:r>
+              <w:rPr>
+                <w:rFonts w:ascii="맑은 고딕" w:cs="맑은 고딕" w:eastAsia="맑은 고딕" w:hAnsi="맑은 고딕"/>
+                <w:b w:val="false"/>
+                <w:bCs w:val="false"/>
+                <w:sz w:val="18"/>
+                <w:szCs w:val="18"/>
+              </w:rPr>
+              <w:t xml:space="preserve">분류(NB/kNN/DT/SVM/로지스틱회귀/RF 등) 또는 회귀(LLM+CatBoost 등)</w:t>
+            </w:r>
+          </w:p>
+        </w:tc>
+        <w:tc>
+          <w:tcPr>
+            <w:tcW w:type="dxa" w:w="1550"/>
+            <w:tcMar>
+              <w:top w:type="dxa" w:w="80"/>
+              <w:left w:type="dxa" w:w="100"/>
+              <w:bottom w:type="dxa" w:w="80"/>
+              <w:right w:type="dxa" w:w="100"/>
+            </w:tcMar>
+          </w:tcPr>
+          <w:p>
+            <w:r>
+              <w:rPr>
+                <w:rFonts w:ascii="맑은 고딕" w:cs="맑은 고딕" w:eastAsia="맑은 고딕" w:hAnsi="맑은 고딕"/>
+                <w:b w:val="false"/>
+                <w:bCs w:val="false"/>
+                <w:sz w:val="18"/>
+                <w:szCs w:val="18"/>
+              </w:rPr>
+              <w:t xml:space="preserve">○ (분류 또는 회귀)</w:t>
+            </w:r>
+          </w:p>
+        </w:tc>
+        <w:tc>
+          <w:tcPr>
+            <w:tcW w:type="dxa" w:w="1600"/>
+            <w:tcMar>
+              <w:top w:type="dxa" w:w="80"/>
+              <w:left w:type="dxa" w:w="100"/>
+              <w:bottom w:type="dxa" w:w="80"/>
+              <w:right w:type="dxa" w:w="100"/>
+            </w:tcMar>
+          </w:tcPr>
+          <w:p>
+            <w:r>
+              <w:rPr>
+                <w:rFonts w:ascii="맑은 고딕" w:cs="맑은 고딕" w:eastAsia="맑은 고딕" w:hAnsi="맑은 고딕"/>
+                <w:b w:val="false"/>
+                <w:bCs w:val="false"/>
+                <w:sz w:val="18"/>
+                <w:szCs w:val="18"/>
+              </w:rPr>
+              <w:t xml:space="preserve">△ (Ma et al. 2013이 bursty/continuous 트렌드 "형태" 비교는 수행, 의미론적 "유형" 비교는 없음)</w:t>
+            </w:r>
+          </w:p>
+        </w:tc>
+      </w:tr>
+      <w:tr>
+        <w:tc>
+          <w:tcPr>
+            <w:tcW w:type="dxa" w:w="1500"/>
+            <w:tcMar>
+              <w:top w:type="dxa" w:w="80"/>
+              <w:left w:type="dxa" w:w="100"/>
+              <w:bottom w:type="dxa" w:w="80"/>
+              <w:right w:type="dxa" w:w="100"/>
+            </w:tcMar>
+          </w:tcPr>
+          <w:p>
+            <w:r>
+              <w:rPr>
+                <w:rFonts w:ascii="맑은 고딕" w:cs="맑은 고딕" w:eastAsia="맑은 고딕" w:hAnsi="맑은 고딕"/>
                 <w:b/>
                 <w:bCs/>
                 <w:sz w:val="18"/>
@@ -1424,7 +1637,7 @@
           <w:sz w:val="21"/>
           <w:szCs w:val="21"/>
         </w:rPr>
-        <w:t xml:space="preserve">본 연구는 선행연구가 검증한 방법론적 요소(백테스팅 구조, ablation 검증, IQR 이상치 탐지, 동음이의어 검증 절차, 교차상관 기반 lag 선택)를 최대한 차용하되, "개별 키워드의 breakout 여부를 이진 분류로 예측"하는 문제 설정과 "카테고리 간 예측 가능성을 정면으로 비교"하는 부분만을 새로운 기여로 좁힌다.</w:t>
+        <w:t xml:space="preserve">본 연구는 선행연구가 검증한 방법론적 요소(백테스팅 구조, ablation 검증, IQR 이상치 탐지, 동음이의어 검증 절차, 교차상관 기반 lag 선택, content/contextual feature 이분법, Precision@K·Recall@K 병행 평가)를 최대한 차용하되, breakout 이진분류라는 문제 설정 자체는 해시태그·주식 도메인에 이미 존재하므로 "새로 제시"하는 것이 아니라 화장품·네이버 검색 트렌드 도메인으로의 적용으로 정확히 자리매김한다. 본 연구가 실제로 새롭게 기여하는 부분은 이 도메인 전이와, "카테고리 간 예측 가능성을 정면으로 비교"하는 부분으로 좁힌다. 차용 요소와 기여의 상세 대응관계는 BORROWED_VS_CONTRIBUTION.md에 별도 정리되어 있다.</w:t>
       </w:r>
     </w:p>
     <w:p>
@@ -1963,7 +2176,7 @@
           <w:sz w:val="21"/>
           <w:szCs w:val="21"/>
         </w:rPr>
-        <w:t xml:space="preserve">봉기태·이희상(2020)의 "과거 구간 학습 → 미래 구간 실측 검증" 구조를 준용하여, 과거 구간(예: ~2022)으로 모델을 학습시키고 이후 구간(2023~2025)에서 실제 breakout 여부와 비교한다. 평가지표로는 Precision@K, Recall@K, AUC를 사용한다. 아울러 카테고리별(성분/컨셉/제형/효능) 변동성 지표(변동계수, peak 대비 baseline 비율, half-life)를 함께 분석하여 RQ2를 뒷받침한다.</w:t>
+        <w:t xml:space="preserve">봉기태·이희상(2020)의 "과거 구간 학습 → 미래 구간 실측 검증" 구조를 준용하여, 과거 구간(예: ~2022)으로 모델을 학습시키고 이후 구간(2023~2025)에서 실제 breakout 여부와 비교한다. 평가지표로는 Precision@K, Recall@K, AUC를 사용한다. Ansary(2022)의 주식 breakout 분류 연구에서 breakout 후보가 희소 클래스라 데이터 불균형 처리(랜덤 언더샘플링)가 필요했던 것처럼, 본 연구도 카테고리별 breakout 비율이 낮을 가능성에 대비해 학습 단계에서 언더샘플링 또는 클래스 가중치 적용 여부를 사전에 검토한다. 아울러 카테고리별(성분/컨셉/제형/효능) 변동성 지표(변동계수, peak 대비 baseline 비율, half-life)를 함께 분석하여 RQ2를 뒷받침한다.</w:t>
       </w:r>
     </w:p>
     <w:p>
@@ -2085,7 +2298,7 @@
           <w:sz w:val="21"/>
           <w:szCs w:val="21"/>
         </w:rPr>
-        <w:t xml:space="preserve">성분/컨셉·클레임/제형/효능 4개 카테고리별로 AUC 등 성능 지표와 변동계수·half-life 등 변동성 지표를 나란히 제시.</w:t>
+        <w:t xml:space="preserve">성분/컨셉·클레임/제형/효능 4개 카테고리별로 AUC 등 성능 지표와 변동계수·half-life 등 변동성 지표를 나란히 제시. 실험 설계는 Ma, Sun &amp; Cong(2013) 5.3절의 "유형별 대표 키워드 선정 → 동일 모델로 예측 → Micro-F1 비교" 구조를 템플릿으로 응용한다(단, 그들은 트렌드 형태별 비교, 본 연구는 의미론적 유형별 비교라는 차이가 있음).</w:t>
       </w:r>
     </w:p>
     <w:p>
@@ -2103,7 +2316,7 @@
           <w:sz w:val="21"/>
           <w:szCs w:val="21"/>
         </w:rPr>
-        <w:t xml:space="preserve">이병욱 외(2018)에서 관찰된 "카테고리마다 검색량-실측치 관계가 다르게 나타난다"는 현상이 화장품 도메인에서도 재현되는지, 그리고 그 차이가 통계적으로 유의한지를 검증.</w:t>
+        <w:t xml:space="preserve">이병욱 외(2018)에서 관찰된 "카테고리마다 검색량-실측치 관계가 다르게 나타난다"는 현상, 그리고 Ma, Sun &amp; Cong(2013)이 트렌드 형태(bursty .640 vs continuous .560)에서 확인한 "유형에 따라 예측 가능성이 다르다"는 현상이 의미론적 카테고리(성분/컨셉/제형/효능) 기준에서도 재현되는지, 그리고 그 차이가 통계적으로 유의한지를 검증.</w:t>
       </w:r>
     </w:p>
     <w:p>
@@ -2280,6 +2493,24 @@
     </w:p>
     <w:p>
       <w:pPr>
+        <w:pStyle w:val="ListParagraph"/>
+        <w:numPr>
+          <w:ilvl w:val="0"/>
+          <w:numId w:val="3"/>
+        </w:numPr>
+        <w:spacing w:after="90" w:line="280"/>
+      </w:pPr>
+      <w:r>
+        <w:rPr>
+          <w:rFonts w:ascii="맑은 고딕" w:cs="맑은 고딕" w:eastAsia="맑은 고딕" w:hAnsi="맑은 고딕"/>
+          <w:sz w:val="21"/>
+          <w:szCs w:val="21"/>
+        </w:rPr>
+        <w:t xml:space="preserve">이진분류라는 단순한 문제 설정의 한계 — 국제 연구의 최신 흐름(BuzzProphet, 2025)은 회귀·LLM 기반 정성적 추론 결합으로 나아가고 있음. 본 연구는 해석 가능성과 실무 활용성을 위해 이진분류를 의도적으로 택했으나, 향후 연구에서는 breakout "여부"뿐 아니라 "강도"까지 예측하는 회귀 확장을 고려할 수 있음.</w:t>
+      </w:r>
+    </w:p>
+    <w:p>
+      <w:pPr>
         <w:pStyle w:val="Heading1"/>
         <w:spacing w:after="160" w:before="360"/>
       </w:pPr>
@@ -2634,6 +2865,78 @@
           <w:szCs w:val="21"/>
         </w:rPr>
         <w:t xml:space="preserve">Korea Herald (2026), "K-beauty exports cross $11b milestone in 2025".</w:t>
+      </w:r>
+    </w:p>
+    <w:p>
+      <w:pPr>
+        <w:pStyle w:val="ListParagraph"/>
+        <w:numPr>
+          <w:ilvl w:val="0"/>
+          <w:numId w:val="2"/>
+        </w:numPr>
+        <w:spacing w:after="90" w:line="280"/>
+      </w:pPr>
+      <w:r>
+        <w:rPr>
+          <w:rFonts w:ascii="맑은 고딕" w:cs="맑은 고딕" w:eastAsia="맑은 고딕" w:hAnsi="맑은 고딕"/>
+          <w:sz w:val="21"/>
+          <w:szCs w:val="21"/>
+        </w:rPr>
+        <w:t xml:space="preserve">Ma, Z., Sun, A., &amp; Cong, G. (2013). On predicting the popularity of newly emerging hashtags in Twitter. Journal of the American Society for Information Science and Technology, 64(7), 1399-1410. (원문 정독 완료, 2026-09-15)</w:t>
+      </w:r>
+    </w:p>
+    <w:p>
+      <w:pPr>
+        <w:pStyle w:val="ListParagraph"/>
+        <w:numPr>
+          <w:ilvl w:val="0"/>
+          <w:numId w:val="2"/>
+        </w:numPr>
+        <w:spacing w:after="90" w:line="280"/>
+      </w:pPr>
+      <w:r>
+        <w:rPr>
+          <w:rFonts w:ascii="맑은 고딕" w:cs="맑은 고딕" w:eastAsia="맑은 고딕" w:hAnsi="맑은 고딕"/>
+          <w:sz w:val="21"/>
+          <w:szCs w:val="21"/>
+        </w:rPr>
+        <w:t xml:space="preserve">Devi, K. N., &amp; Geetha, R., "Trendingtags — Classification &amp; Prediction of Hashtag Popularity Using Twitter Features in Machine Learning Approach". (미확인 — 검색 스니펫만 파악)</w:t>
+      </w:r>
+    </w:p>
+    <w:p>
+      <w:pPr>
+        <w:pStyle w:val="ListParagraph"/>
+        <w:numPr>
+          <w:ilvl w:val="0"/>
+          <w:numId w:val="2"/>
+        </w:numPr>
+        <w:spacing w:after="90" w:line="280"/>
+      </w:pPr>
+      <w:r>
+        <w:rPr>
+          <w:rFonts w:ascii="맑은 고딕" w:cs="맑은 고딕" w:eastAsia="맑은 고딕" w:hAnsi="맑은 고딕"/>
+          <w:sz w:val="21"/>
+          <w:szCs w:val="21"/>
+        </w:rPr>
+        <w:t xml:space="preserve">Ansary, M. S. (2022). Breakout Stocks Identification using Machine Learning Approaches. ENP Engineering Science Journal, 2(2), 52-56. (원문 정독 완료, 2026-09-15)</w:t>
+      </w:r>
+    </w:p>
+    <w:p>
+      <w:pPr>
+        <w:pStyle w:val="ListParagraph"/>
+        <w:numPr>
+          <w:ilvl w:val="0"/>
+          <w:numId w:val="2"/>
+        </w:numPr>
+        <w:spacing w:after="90" w:line="280"/>
+      </w:pPr>
+      <w:r>
+        <w:rPr>
+          <w:rFonts w:ascii="맑은 고딕" w:cs="맑은 고딕" w:eastAsia="맑은 고딕" w:hAnsi="맑은 고딕"/>
+          <w:sz w:val="21"/>
+          <w:szCs w:val="21"/>
+        </w:rPr>
+        <w:t xml:space="preserve">Xu, Y., Wu, J., Wan, H., Li, Y., Hou, Z., &amp; Kan, M.-Y. (2025). Forecasting the Buzz: Enriching Hashtag Popularity Prediction with LLM Reasoning. Proceedings of the 34th ACM International Conference on Information and Knowledge Management (CIKM '25). (원문 정독 완료, 2026-09-15)</w:t>
       </w:r>
     </w:p>
     <w:p>
@@ -2658,7 +2961,7 @@
           <w:sz w:val="20"/>
           <w:szCs w:val="20"/>
         </w:rPr>
-        <w:t xml:space="preserve">1.1절의 산업 통계는 2026-09 시점 웹 검색으로 확인한 수치이며, 실제 제출 전 반드시 원출처(관세청/코트라 수출입통계, 올리브영 IR자료, 통계청 등 1차 자료)를 대조해 정확한 수치와 발표 시점을 재확인할 것. 특히 "세계 2위 수출국", "매출 5.8조원" 등은 언론 보도 기준이므로 학술논문 인용 기준으로는 공식 통계 원자료(관세청, 식약처, 코트라)로 대체하는 것이 바람직함.</w:t>
+        <w:t xml:space="preserve">20·22·23번 문헌은 사용자가 직접 원문 PDF를 확보해 2026-09-15 전체 정독·검증 완료. 21번(Devi &amp; Geetha)만 아직 원문 미확인 상태로 남아있음 — 인용 시 검색 스니펫 기반임을 유의하거나, 접근 가능해지면 원문 확인 후 사용 권장.</w:t>
       </w:r>
     </w:p>
     <w:p>
@@ -2678,6 +2981,26 @@
           <w:sz w:val="20"/>
           <w:szCs w:val="20"/>
         </w:rPr>
+        <w:t xml:space="preserve">1.1절의 산업 통계는 2026-09 시점 웹 검색으로 확인한 수치이며, 실제 제출 전 반드시 원출처(관세청/코트라 수출입통계, 올리브영 IR자료, 통계청 등 1차 자료)를 대조해 정확한 수치와 발표 시점을 재확인할 것. 특히 "세계 2위 수출국", "매출 5.8조원" 등은 언론 보도 기준이므로 학술논문 인용 기준으로는 공식 통계 원자료(관세청, 식약처, 코트라)로 대체하는 것이 바람직함.</w:t>
+      </w:r>
+    </w:p>
+    <w:p>
+      <w:pPr>
+        <w:pBdr>
+          <w:left w:val="single" w:color="4472C4" w:sz="12" w:space="8"/>
+        </w:pBdr>
+        <w:shd w:fill="F2F6FC" w:val="clear"/>
+        <w:spacing w:after="140" w:line="280"/>
+      </w:pPr>
+      <w:r>
+        <w:rPr>
+          <w:rFonts w:ascii="맑은 고딕" w:cs="맑은 고딕" w:eastAsia="맑은 고딕" w:hAnsi="맑은 고딕"/>
+          <w:i/>
+          <w:iCs/>
+          <w:color w:val="444444"/>
+          <w:sz w:val="20"/>
+          <w:szCs w:val="20"/>
+        </w:rPr>
         <w:t xml:space="preserve">참고문헌은 실제 제출 시 학술제 지정 표기법(각주 [1], [2] 형식)으로 변환 필요. 위 목록은 우선 APA 유사 형식으로 정리한 초안이며, 최종 논문 작성 시 서식 가이드에 맞춰 재정리할 예정.</w:t>
       </w:r>
     </w:p>
@@ -2695,6 +3018,24 @@
           <w:szCs w:val="28"/>
         </w:rPr>
         <w:t xml:space="preserve">교수님께 확인받고 싶은 부분</w:t>
+      </w:r>
+    </w:p>
+    <w:p>
+      <w:pPr>
+        <w:pStyle w:val="ListParagraph"/>
+        <w:numPr>
+          <w:ilvl w:val="0"/>
+          <w:numId w:val="2"/>
+        </w:numPr>
+        <w:spacing w:after="90" w:line="280"/>
+      </w:pPr>
+      <w:r>
+        <w:rPr>
+          <w:rFonts w:ascii="맑은 고딕" w:cs="맑은 고딕" w:eastAsia="맑은 고딕" w:hAnsi="맑은 고딕"/>
+          <w:sz w:val="21"/>
+          <w:szCs w:val="21"/>
+        </w:rPr>
+        <w:t xml:space="preserve">(2026-09-14 발견 → 09-15 원문 검증 완료) 애초 초안에는 "개별 키워드 breakout 이진분류라는 문제 설정 자체가 선행연구에 없다"고 썼으나, 해시태그(Ma, Sun &amp; Cong, 2013)·주식(Ansary, 2022) 도메인에는 이미 이 문제 설정이 존재함을 원문으로 확인. 더 나아가 Ma et al.(2013)은 해시태그를 bursty/continuous 두 "형태"로 나눠 예측정확도를 비교하는 실험까지 이미 수행(Micro-F1 .640 vs .560)했음도 확인. 이에 따라 차별점 주장을 "도메인 전이(화장품·네이버 검색 트렌드에 최초 적용) + 트렌드 형태가 아닌 키워드의 의미론적 유형(성분/컨셉/제형/효능) 간 비교"로 한 번 더 정밀하게 좁힘. 이 방향의 차별점 주장이 학술제 심사 기준으로 충분한지, 그리고 "형태별 비교 vs 의미론적 유형별 비교"라는 구분이 심사위원에게 설득력 있게 읽히는지 검토 부탁드립니다. (Devi &amp; Geetha 1편만 아직 원문 미확인.)</w:t>
       </w:r>
     </w:p>
     <w:p>

</xml_diff>